<commit_message>
ayuda activa de todos los miembros en el desarrolo del uml
</commit_message>
<xml_diff>
--- a/Entrega2_ASI.docx
+++ b/Entrega2_ASI.docx
@@ -344,12 +344,6 @@
         <w:tblStyle w:val="TableGrid"/>
         <w:tblW w:w="9512" w:type="dxa"/>
         <w:tblInd w:w="48" w:type="dxa"/>
-        <w:tblCellMar>
-          <w:top w:w="0" w:type="dxa"/>
-          <w:left w:w="0" w:type="dxa"/>
-          <w:bottom w:w="0" w:type="dxa"/>
-          <w:right w:w="0" w:type="dxa"/>
-        </w:tblCellMar>
         <w:tblLook w:val="04A0" w:firstRow="1" w:lastRow="0" w:firstColumn="1" w:lastColumn="0" w:noHBand="0" w:noVBand="1"/>
       </w:tblPr>
       <w:tblGrid>
@@ -558,13 +552,7 @@
         <w:rPr>
           <w:b/>
         </w:rPr>
-        <w:t>Presentación</w:t>
-      </w:r>
-      <w:r>
-        <w:rPr>
-          <w:b/>
-        </w:rPr>
-        <w:t>.....................................................................................................................2</w:t>
+        <w:t>Presentación.....................................................................................................................2</w:t>
       </w:r>
       <w:r>
         <w:t xml:space="preserve"> </w:t>
@@ -612,13 +600,7 @@
         <w:rPr>
           <w:b/>
         </w:rPr>
-        <w:t>Elicitación</w:t>
-      </w:r>
-      <w:r>
-        <w:rPr>
-          <w:b/>
-        </w:rPr>
-        <w:t>......................................................................................................................... 4</w:t>
+        <w:t>Elicitación......................................................................................................................... 4</w:t>
       </w:r>
       <w:r>
         <w:t xml:space="preserve"> </w:t>
@@ -784,10 +766,7 @@
         <w:t xml:space="preserve">’ </w:t>
       </w:r>
       <w:r>
-        <w:t xml:space="preserve">un grupo de trabajo apasionado por la tecnología y la optimización de </w:t>
-      </w:r>
-      <w:r>
-        <w:t xml:space="preserve">procesos. Caracterizados por la capacidad de transformar necesidades complejas en soluciones digitales concretas, combinando un enfoque analítico riguroso con una ejecución técnica precisa. Nuestro objetivo es ser el puente entre los desafíos operativos de nuestros clientes y la eficiencia tecnológica que impulsa el crecimiento. </w:t>
+        <w:t xml:space="preserve">un grupo de trabajo apasionado por la tecnología y la optimización de procesos. Caracterizados por la capacidad de transformar necesidades complejas en soluciones digitales concretas, combinando un enfoque analítico riguroso con una ejecución técnica precisa. Nuestro objetivo es ser el puente entre los desafíos operativos de nuestros clientes y la eficiencia tecnológica que impulsa el crecimiento. </w:t>
       </w:r>
     </w:p>
     <w:p>
@@ -834,13 +813,7 @@
           <w:b/>
           <w:u w:val="single" w:color="000000"/>
         </w:rPr>
-        <w:t>Enunciado corregido</w:t>
-      </w:r>
-      <w:r>
-        <w:rPr>
-          <w:b/>
-        </w:rPr>
-        <w:t xml:space="preserve"> </w:t>
+        <w:t xml:space="preserve">Enunciado </w:t>
       </w:r>
     </w:p>
     <w:p>
@@ -954,15 +927,7 @@
         <w:ind w:hanging="360"/>
       </w:pPr>
       <w:r>
-        <w:t xml:space="preserve">Consultar retiros agendados .El sistema permitirá consultar los </w:t>
-      </w:r>
-      <w:proofErr w:type="gramStart"/>
-      <w:r>
-        <w:t>retiros  por</w:t>
-      </w:r>
-      <w:proofErr w:type="gramEnd"/>
-      <w:r>
-        <w:t xml:space="preserve"> los datos ingresados. </w:t>
+        <w:t xml:space="preserve">Consultar retiros agendados .El sistema permitirá consultar los retiros  por los datos ingresados. </w:t>
       </w:r>
     </w:p>
     <w:p>
@@ -1014,15 +979,7 @@
         <w:ind w:hanging="360"/>
       </w:pPr>
       <w:r>
-        <w:t xml:space="preserve">Registrar el pago de un retiro .El sistema deberá permitir registrar el pago </w:t>
-      </w:r>
-      <w:proofErr w:type="gramStart"/>
-      <w:r>
-        <w:t>total  y</w:t>
-      </w:r>
-      <w:proofErr w:type="gramEnd"/>
-      <w:r>
-        <w:t xml:space="preserve">/o parcial del retiro </w:t>
+        <w:t xml:space="preserve">Registrar el pago de un retiro .El sistema deberá permitir registrar el pago total  y/o parcial del retiro </w:t>
       </w:r>
       <w:proofErr w:type="spellStart"/>
       <w:r>
@@ -1062,15 +1019,7 @@
         <w:ind w:hanging="360"/>
       </w:pPr>
       <w:r>
-        <w:t xml:space="preserve">Enviar alerta </w:t>
-      </w:r>
-      <w:proofErr w:type="gramStart"/>
-      <w:r>
-        <w:t>de  proximidad</w:t>
-      </w:r>
-      <w:proofErr w:type="gramEnd"/>
-      <w:r>
-        <w:t xml:space="preserve"> de la fecha del retiro. </w:t>
+        <w:t xml:space="preserve">Enviar alerta de  proximidad de la fecha del retiro. </w:t>
       </w:r>
     </w:p>
     <w:p>
@@ -1167,10 +1116,7 @@
         <w:ind w:hanging="360"/>
       </w:pPr>
       <w:r>
-        <w:t xml:space="preserve">El sistema deberá calcular y </w:t>
-      </w:r>
-      <w:r>
-        <w:t xml:space="preserve">mostrar los gastos asociados a cada retiro, incluyendo costos de inscripción, transporte y otros adicionales. </w:t>
+        <w:t xml:space="preserve">El sistema deberá calcular y mostrar los gastos asociados a cada retiro, incluyendo costos de inscripción, transporte y otros adicionales. </w:t>
       </w:r>
     </w:p>
     <w:p>
@@ -1538,10 +1484,7 @@
         <w:t xml:space="preserve">Brahma Kumaris: </w:t>
       </w:r>
       <w:r>
-        <w:t xml:space="preserve">Centros de Retiros </w:t>
-      </w:r>
-      <w:r>
-        <w:t>(Internacional, con presencia en Argentina) Ofrecen retiros espirituales basados en meditación Raja Yoga.</w:t>
+        <w:t>Centros de Retiros (Internacional, con presencia en Argentina) Ofrecen retiros espirituales basados en meditación Raja Yoga.</w:t>
       </w:r>
       <w:r>
         <w:rPr>
@@ -2048,15 +1991,7 @@
         <w:t xml:space="preserve">Denise Cosentino: </w:t>
       </w:r>
       <w:r>
-        <w:t xml:space="preserve">Retiro mágico enfocado en yoga, alimentación, canto de </w:t>
-      </w:r>
-      <w:proofErr w:type="gramStart"/>
-      <w:r>
-        <w:t>mantras  y</w:t>
-      </w:r>
-      <w:proofErr w:type="gramEnd"/>
-      <w:r>
-        <w:t xml:space="preserve"> ceremonia sagrada</w:t>
+        <w:t>Retiro mágico enfocado en yoga, alimentación, canto de mantras  y ceremonia sagrada</w:t>
       </w:r>
       <w:r>
         <w:rPr>
@@ -2366,10 +2301,7 @@
         <w:t>Logística:</w:t>
       </w:r>
       <w:r>
-        <w:t xml:space="preserve"> El tipo de </w:t>
-      </w:r>
-      <w:r>
-        <w:t xml:space="preserve">traslado que se utilizará (ej.: si se viaja en auto propio o si la organización provee el transporte). </w:t>
+        <w:t xml:space="preserve"> El tipo de traslado que se utilizará (ej.: si se viaja en auto propio o si la organización provee el transporte). </w:t>
       </w:r>
     </w:p>
     <w:p>
@@ -2646,7 +2578,7 @@
         </mc:Choice>
         <mc:Fallback>
           <w:pict>
-            <v:group w14:anchorId="196FB8CC" id="Group 18003" o:spid="_x0000_s1032" style="position:absolute;margin-left:488.25pt;margin-top:704.3pt;width:53.25pt;height:47.25pt;z-index:251661312;mso-position-horizontal-relative:page;mso-position-vertical-relative:page" coordsize="6762,6000" o:gfxdata="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">
+            <v:group w14:anchorId="196FB8CC" id="Group 18003" o:spid="_x0000_s1032" style="position:absolute;margin-left:488.25pt;margin-top:704.3pt;width:53.25pt;height:47.25pt;z-index:251661312;mso-position-horizontal-relative:page;mso-position-vertical-relative:page" coordsize="6762,6000" o:gfxdata="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">
               <v:rect id="Rectangle 18005" o:spid="_x0000_s1033" style="position:absolute;left:3381;top:521;width:516;height:1746;visibility:visible;mso-wrap-style:square;v-text-anchor:top" o:gfxdata="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" filled="f" stroked="f">
                 <v:textbox inset="0,0,0,0">
                   <w:txbxContent>
@@ -2719,10 +2651,7 @@
       <w:ind w:left="3222" w:right="417" w:hanging="2979"/>
     </w:pPr>
     <w:r>
-      <w:t xml:space="preserve">Ignacio Eduardo, Oberto Federico Martín, Rubilar Ivo </w:t>
-    </w:r>
-    <w:r>
-      <w:t xml:space="preserve">Valentín, Torres Jeremías, Verra José Ignacio  </w:t>
+      <w:t xml:space="preserve">Ignacio Eduardo, Oberto Federico Martín, Rubilar Ivo Valentín, Torres Jeremías, Verra José Ignacio  </w:t>
     </w:r>
   </w:p>
   <w:p>
@@ -2873,7 +2802,7 @@
         </mc:Choice>
         <mc:Fallback>
           <w:pict>
-            <v:group w14:anchorId="239A1ECB" id="Group 17872" o:spid="_x0000_s1035" style="position:absolute;margin-left:488.25pt;margin-top:704.3pt;width:53.25pt;height:47.25pt;z-index:251662336;mso-position-horizontal-relative:page;mso-position-vertical-relative:page" coordsize="6762,6000" o:gfxdata="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">
+            <v:group w14:anchorId="239A1ECB" id="Group 17872" o:spid="_x0000_s1035" style="position:absolute;margin-left:488.25pt;margin-top:704.3pt;width:53.25pt;height:47.25pt;z-index:251662336;mso-position-horizontal-relative:page;mso-position-vertical-relative:page" coordsize="6762,6000" o:gfxdata="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">
               <v:rect id="Rectangle 17874" o:spid="_x0000_s1036" style="position:absolute;left:3381;top:521;width:516;height:1746;visibility:visible;mso-wrap-style:square;v-text-anchor:top" o:gfxdata="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" filled="f" stroked="f">
                 <v:textbox inset="0,0,0,0">
                   <w:txbxContent>
@@ -2946,10 +2875,7 @@
       <w:ind w:left="3222" w:right="417" w:hanging="2979"/>
     </w:pPr>
     <w:r>
-      <w:t xml:space="preserve">Ignacio Eduardo, Oberto Federico Martín, Rubilar Ivo Valentín, Torres Jeremías, Verra </w:t>
-    </w:r>
-    <w:r>
-      <w:t xml:space="preserve">José Ignacio  </w:t>
+      <w:t xml:space="preserve">Ignacio Eduardo, Oberto Federico Martín, Rubilar Ivo Valentín, Torres Jeremías, Verra José Ignacio  </w:t>
     </w:r>
   </w:p>
   <w:p>
@@ -3784,7 +3710,7 @@
         </mc:Choice>
         <mc:Fallback>
           <w:pict>
-            <v:group w14:anchorId="00D7127C" id="Group 17680" o:spid="_x0000_s1038" style="position:absolute;margin-left:353.25pt;margin-top:44.1pt;width:170.25pt;height:50.25pt;z-index:251660288;mso-position-horizontal-relative:page;mso-position-vertical-relative:page" coordsize="21621,6381" o:gfxdata="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">
+            <v:group w14:anchorId="00D7127C" id="Group 17680" o:spid="_x0000_s1038" style="position:absolute;margin-left:353.25pt;margin-top:44.1pt;width:170.25pt;height:50.25pt;z-index:251660288;mso-position-horizontal-relative:page;mso-position-vertical-relative:page" coordsize="21621,6381" o:gfxdata="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">
               <v:rect id="Rectangle 17682" o:spid="_x0000_s1039" style="position:absolute;left:10191;top:902;width:516;height:1746;visibility:visible;mso-wrap-style:square;v-text-anchor:top" o:gfxdata="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" filled="f" stroked="f">
                 <v:textbox inset="0,0,0,0">
                   <w:txbxContent>

</xml_diff>